<commit_message>
Archive finished data-request paperwork; fix the stale design-half test (C2)
- docs/archive/: PRICE_REQUEST.md, Bloomberg workbook, CRSP ticker lists, BLOOMBERG_UPDATE.md,
  the first report draft (REPORT_DRAFT_v1.md) and the teammate's first Bloomberg run
  (was outputs/tables/bloomberg_fill/); every path that pointed at them updated
- C2: tests/test_confirmatory.py asserted the Yahoo design-half values after C1 changed the
  headline prices; it now checks the registered Yahoo values or the C1 values by config.
  DECISIONS.md C2 logs the design-half before/after values C1 had left out (H4 flips sign)
- Report V2 Appendix D notes the design-half shift
- no pipeline output changed; 183 tests pass

Co-Authored-By: Claude Opus 5.5 <noreply@anthropic.com>
Claude-Session: https://claude.ai/code/session_015Z1jkRHKet2rDcBW9tKajd
</commit_message>
<xml_diff>
--- a/report/Copying_the_Senate_Report_V2.docx
+++ b/report/Copying_the_Senate_Report_V2.docx
@@ -1882,7 +1882,7 @@
           <w:sz w:val="22"/>
           <w:szCs w:val="22"/>
         </w:rPr>
-        <w:t xml:space="preserve"> All seven delisted names were taken over, and the large positions in U.S. Steel, ChannelAdvisor and Activision rose on the bids (docs/BLOOMBERG_UPDATE.md), so pricing them raised Series A from 10.81% to 13.41% a year (Appendix D). Filling the gaps with SPY's return (variant V15) is therefore not a conservative bound. Because this change was made after the test half was opened, it is logged as post-unlock correction C1 with every before and after value. The Yahoo-only result is kept as variant V18. No verdict changed.</w:t>
+        <w:t xml:space="preserve"> All seven delisted names were taken over, and the large positions in U.S. Steel, ChannelAdvisor and Activision rose on the bids (docs/archive/BLOOMBERG_UPDATE.md), so pricing them raised Series A from 10.81% to 13.41% a year (Appendix D). Filling the gaps with SPY's return (variant V15) is therefore not a conservative bound. Because this change was made after the test half was opened, it is logged as post-unlock correction C1 with every before and after value. The Yahoo-only result is kept as variant V18. No verdict changed.</w:t>
       </w:r>
     </w:p>
     <w:p>
@@ -15730,7 +15730,7 @@
           <w:sz w:val="17"/>
           <w:szCs w:val="17"/>
         </w:rPr>
-        <w:t xml:space="preserve">The second half barely moves (22.95% to 22.94%) and every registered verdict is unchanged; only the H2 reversal reading moved, from "not reversed" to "partly reversed". Before and after values for every affected number are in docs/DECISIONS.md, "Post-unlock corrections".</w:t>
+        <w:t xml:space="preserve">The second half barely moves (22.95% to 22.94%) and every registered verdict is unchanged; only the H2 reversal reading moved, from "not reversed" to "partly reversed". The design-half statistics move more (Series A from −0.14% to 4.61% a year; H4 from +3.98% to −2.85%), but the predictions were registered on the Yahoo values before the correction and stand unchanged. Every before and after value is in docs/DECISIONS.md, corrections C1 and C2.</w:t>
       </w:r>
     </w:p>
     <w:p>

</xml_diff>